<commit_message>
Restyle manuscript template: black opening text and MDPI-teal journal header.
Header bar shows Biological Systems and Methods with MDPI-like teal fill; title block at the top of the first page uses black text.

Co-authored-by: Cursor <cursoragent@cursor.com>
</commit_message>
<xml_diff>
--- a/templates/BSM-manuscript-template.docx
+++ b/templates/BSM-manuscript-template.docx
@@ -13,7 +13,7 @@
           <w:rFonts w:ascii="Palatino Linotype" w:hAnsi="Palatino Linotype" w:eastAsia="Palatino Linotype" w:cs="Palatino Linotype"/>
           <w:b/>
           <w:i w:val="0"/>
-          <w:color w:val="0D2B28"/>
+          <w:color w:val="000000"/>
           <w:sz w:val="36"/>
         </w:rPr>
         <w:t>Biological Systems and Methods</w:t>
@@ -30,7 +30,7 @@
           <w:rFonts w:ascii="Palatino Linotype" w:hAnsi="Palatino Linotype" w:eastAsia="Palatino Linotype" w:cs="Palatino Linotype"/>
           <w:b/>
           <w:i w:val="0"/>
-          <w:color w:val="0D2B28"/>
+          <w:color w:val="000000"/>
           <w:sz w:val="28"/>
         </w:rPr>
         <w:t>Биологические системы и методы (BSM)</w:t>
@@ -47,10 +47,10 @@
           <w:rFonts w:ascii="Palatino Linotype" w:hAnsi="Palatino Linotype" w:eastAsia="Palatino Linotype" w:cs="Palatino Linotype"/>
           <w:b w:val="0"/>
           <w:i/>
-          <w:color w:val="5A6870"/>
+          <w:color w:val="000000"/>
           <w:sz w:val="22"/>
         </w:rPr>
-        <w:t>An International Journal of Experimental and Computational Biosciences</w:t>
+        <w:t>An International Journal of Biological Research and Methodology</w:t>
       </w:r>
     </w:p>
     <w:p>
@@ -64,7 +64,7 @@
           <w:rFonts w:ascii="Palatino Linotype" w:hAnsi="Palatino Linotype" w:eastAsia="Palatino Linotype" w:cs="Palatino Linotype"/>
           <w:b w:val="0"/>
           <w:i w:val="0"/>
-          <w:color w:val="5A6870"/>
+          <w:color w:val="000000"/>
           <w:sz w:val="20"/>
         </w:rPr>
         <w:t>Шаблон рукописи  ·  Palatino Linotype  ·  ГОСТ (А4, поля 30/15/20/20 мм, 14 пт, интервал 1,5)  ·  CC BY 4.0 (planned)</w:t>
@@ -2157,7 +2157,7 @@
         <w:rFonts w:ascii="Palatino Linotype" w:hAnsi="Palatino Linotype" w:eastAsia="Palatino Linotype" w:cs="Palatino Linotype"/>
         <w:b w:val="0"/>
         <w:i w:val="0"/>
-        <w:color w:val="5A6870"/>
+        <w:color w:val="00A496"/>
         <w:sz w:val="18"/>
       </w:rPr>
       <w:t xml:space="preserve">BSM  ·  стр. </w:t>
@@ -2167,11 +2167,12 @@
         <w:rFonts w:ascii="Palatino Linotype" w:hAnsi="Palatino Linotype" w:eastAsia="Palatino Linotype" w:cs="Palatino Linotype"/>
         <w:b w:val="0"/>
         <w:i w:val="0"/>
-        <w:color w:val="5A6870"/>
+        <w:color w:val="00A496"/>
         <w:sz w:val="18"/>
       </w:rPr>
       <w:fldChar w:fldCharType="begin"/>
       <w:instrText xml:space="preserve"> PAGE </w:instrText>
+      <w:fldChar w:fldCharType="separate"/>
       <w:fldChar w:fldCharType="end"/>
     </w:r>
   </w:p>
@@ -2183,24 +2184,68 @@
   <w:p>
     <w:pPr>
       <w:pStyle w:val="Header"/>
-      <w:spacing w:before="0" w:after="40" w:lineRule="auto" w:line="240"/>
+    </w:pPr>
+    <w:r/>
+  </w:p>
+  <w:tbl>
+    <w:tblPr>
+      <w:tblW w:type="auto" w:w="0"/>
+      <w:tblLayout w:type="autofit"/>
+      <w:tblLook w:firstColumn="1" w:firstRow="1" w:lastColumn="0" w:lastRow="0" w:noHBand="0" w:noVBand="1" w:val="04A0"/>
+    </w:tblPr>
+    <w:tblGrid>
+      <w:gridCol w:w="9354"/>
+    </w:tblGrid>
+    <w:tr>
+      <w:tc>
+        <w:tcPr>
+          <w:tcW w:type="dxa" w:w="9354"/>
+          <w:shd w:fill="00A496" w:val="clear"/>
+          <w:tcMar>
+            <w:top w:w="60" w:type="dxa"/>
+            <w:bottom w:w="60" w:type="dxa"/>
+            <w:left w:w="100" w:type="dxa"/>
+            <w:right w:w="100" w:type="dxa"/>
+          </w:tcMar>
+        </w:tcPr>
+        <w:p>
+          <w:pPr>
+            <w:spacing w:before="0" w:after="0" w:lineRule="auto" w:line="240"/>
+            <w:ind w:left="0" w:right="0" w:firstLine="0"/>
+            <w:jc w:val="left"/>
+          </w:pPr>
+          <w:r/>
+          <w:r>
+            <w:rPr>
+              <w:rFonts w:ascii="Palatino Linotype" w:hAnsi="Palatino Linotype" w:eastAsia="Palatino Linotype" w:cs="Palatino Linotype"/>
+              <w:b/>
+              <w:i w:val="0"/>
+              <w:color w:val="FFFFFF"/>
+              <w:sz w:val="20"/>
+            </w:rPr>
+            <w:t>Biological Systems and Methods  ·  BSM</w:t>
+          </w:r>
+          <w:r>
+            <w:rPr>
+              <w:rFonts w:ascii="Palatino Linotype" w:hAnsi="Palatino Linotype" w:eastAsia="Palatino Linotype" w:cs="Palatino Linotype"/>
+              <w:b w:val="0"/>
+              <w:i/>
+              <w:color w:val="FFFFFF"/>
+              <w:sz w:val="16"/>
+            </w:rPr>
+            <w:br/>
+            <w:t>An International Journal of Biological Research and Methodology</w:t>
+          </w:r>
+        </w:p>
+      </w:tc>
+    </w:tr>
+  </w:tbl>
+  <w:p>
+    <w:pPr>
+      <w:spacing w:before="40" w:after="0" w:lineRule="auto" w:line="240"/>
       <w:ind w:left="0" w:right="0" w:firstLine="0"/>
       <w:jc w:val="left"/>
-      <w:pBdr>
-        <w:bottom w:val="single" w:sz="6" w:space="4" w:color="0D2B28"/>
-      </w:pBdr>
-    </w:pPr>
-    <w:r/>
-    <w:r>
-      <w:rPr>
-        <w:rFonts w:ascii="Palatino Linotype" w:hAnsi="Palatino Linotype" w:eastAsia="Palatino Linotype" w:cs="Palatino Linotype"/>
-        <w:b w:val="0"/>
-        <w:i w:val="0"/>
-        <w:color w:val="5A6870"/>
-        <w:sz w:val="18"/>
-      </w:rPr>
-      <w:t>Biological Systems and Methods (BSM)  ·  An International Journal of Experimental and Computational Biosciences  ·  Manuscript template (GOST)</w:t>
-    </w:r>
+    </w:pPr>
   </w:p>
 </w:hdr>
 </file>
@@ -2574,6 +2619,7 @@
     </w:pPr>
     <w:rPr>
       <w:rFonts w:ascii="Palatino Linotype" w:hAnsi="Palatino Linotype" w:eastAsia="Palatino Linotype" w:cs="Palatino Linotype"/>
+      <w:color w:val="000000"/>
       <w:sz w:val="28"/>
     </w:rPr>
   </w:style>

</xml_diff>